<commit_message>
Set up uv for package management
</commit_message>
<xml_diff>
--- a/reports/Business_and_Data_Understanding.docx
+++ b/reports/Business_and_Data_Understanding.docx
@@ -5,6 +5,9 @@
     <w:p>
       <w:pPr>
         <w:pStyle w:val="Title"/>
+        <w:pBdr>
+          <w:bottom w:val="single" w:sz="8" w:space="5" w:color="4F81BD" w:themeColor="accent1"/>
+        </w:pBdr>
         <w:spacing w:line="360" w:lineRule="auto"/>
         <w:jc w:val="center"/>
         <w:rPr>
@@ -37,7 +40,7 @@
           <w:sz w:val="24"/>
           <w:szCs w:val="24"/>
         </w:rPr>
-        <w:t>MIMIC-IV ICU Analytics Project</w:t>
+        <w:t>ICU Patient Care Analysis Project</w:t>
       </w:r>
     </w:p>
     <w:p>
@@ -5864,7 +5867,7 @@
               <w:sz w:val="24"/>
               <w:szCs w:val="24"/>
             </w:rPr>
-            <w:t>Works Cited</w:t>
+            <w:t>References</w:t>
           </w:r>
         </w:p>
         <w:p>
@@ -6211,7 +6214,7 @@
   <w:abstractNum w:abstractNumId="8" w15:restartNumberingAfterBreak="0">
     <w:nsid w:val="FFFFFF89"/>
     <w:multiLevelType w:val="singleLevel"/>
-    <w:tmpl w:val="29761A62"/>
+    <w:tmpl w:val="04D22BB0"/>
     <w:lvl w:ilvl="0">
       <w:start w:val="1"/>
       <w:numFmt w:val="bullet"/>

</xml_diff>